<commit_message>
Polish pipeline diagram and split confusion matrices
</commit_message>
<xml_diff>
--- a/article/Article09_QMI_Submission_Final.docx
+++ b/article/Article09_QMI_Submission_Final.docx
@@ -17818,8 +17818,8 @@
       <w:r>
         <w:drawing>
           <wp:inline xmlns:a="http://schemas.openxmlformats.org/drawingml/2006/main" xmlns:pic="http://schemas.openxmlformats.org/drawingml/2006/picture">
-            <wp:extent cx="6080760" cy="5326339"/>
-            <wp:docPr id="6" name="Picture 6" title="Figure 6 Row-normalized test confusion matrices selected without test-performance access; every cell, including 0.00 values, is generated from prediction-level notebook outputs" descr="Figure 6 Row-normalized test confusion matrices selected without test-performance access; every cell, including 0.00 values, is generated from prediction-level notebook outputs"/>
+            <wp:extent cx="4983480" cy="4399718"/>
+            <wp:docPr id="6" name="Picture 6" title="Figure 6a Row-normalized CIFAR-10 test confusion matrix for validation-selected SLP-6 with logistic regression" descr="Figure 6a Row-normalized CIFAR-10 test confusion matrix for validation-selected SLP-6 with logistic regression"/>
             <wp:cNvGraphicFramePr>
               <a:graphicFrameLocks noChangeAspect="1"/>
             </wp:cNvGraphicFramePr>
@@ -17827,7 +17827,7 @@
               <a:graphicData uri="http://schemas.openxmlformats.org/drawingml/2006/picture">
                 <pic:pic>
                   <pic:nvPicPr>
-                    <pic:cNvPr id="0" name="figure_06_confusion_matrices.png"/>
+                    <pic:cNvPr id="0" name="figure_06a_confusion_cifar10.png"/>
                     <pic:cNvPicPr/>
                   </pic:nvPicPr>
                   <pic:blipFill>
@@ -17839,7 +17839,7 @@
                   <pic:spPr>
                     <a:xfrm>
                       <a:off x="0" y="0"/>
-                      <a:ext cx="6080760" cy="5326339"/>
+                      <a:ext cx="4983480" cy="4399718"/>
                     </a:xfrm>
                     <a:prstGeom prst="rect"/>
                   </pic:spPr>
@@ -17858,18 +17858,160 @@
       </w:pPr>
       <w:r>
         <w:rPr>
-          <w:rFonts w:ascii="Arial Narrow" w:hAnsi="Arial Narrow"/>
-          <w:b/>
+          <w:rFonts w:ascii="Times New Roman" w:hAnsi="Times New Roman"/>
           <w:sz w:val="17"/>
         </w:rPr>
-        <w:t xml:space="preserve">Figure 6 </w:t>
+        <w:t>Figure 6a Row-normalized CIFAR-10 test confusion matrix for validation-selected SLP-6 with logistic regression</w:t>
       </w:r>
+    </w:p>
+    <w:p>
+      <w:pPr>
+        <w:sectPr>
+          <w:type w:val="continuous"/>
+          <w:pgSz w:w="11906" w:h="15817"/>
+          <w:pgMar w:top="677" w:right="1020" w:bottom="691" w:left="1020" w:header="720" w:footer="720" w:gutter="0"/>
+          <w:cols w:space="0" w:num="1"/>
+          <w:docGrid w:linePitch="360"/>
+        </w:sectPr>
+      </w:pPr>
+    </w:p>
+    <w:p>
+      <w:pPr>
+        <w:sectPr>
+          <w:type w:val="continuous"/>
+          <w:pgSz w:w="11906" w:h="15817"/>
+          <w:pgMar w:top="677" w:right="1020" w:bottom="691" w:left="1020" w:header="720" w:footer="720" w:gutter="0"/>
+          <w:cols w:space="300" w:num="2"/>
+          <w:docGrid w:linePitch="360"/>
+        </w:sectPr>
+      </w:pPr>
+    </w:p>
+    <w:p>
+      <w:pPr>
+        <w:jc w:val="center"/>
+      </w:pPr>
+      <w:r>
+        <w:drawing>
+          <wp:inline xmlns:a="http://schemas.openxmlformats.org/drawingml/2006/main" xmlns:pic="http://schemas.openxmlformats.org/drawingml/2006/picture">
+            <wp:extent cx="4983480" cy="4399718"/>
+            <wp:docPr id="7" name="Picture 7" title="Figure 6b Row-normalized EuroSAT test confusion matrix for validation-selected SLP-6 with logistic regression" descr="Figure 6b Row-normalized EuroSAT test confusion matrix for validation-selected SLP-6 with logistic regression"/>
+            <wp:cNvGraphicFramePr>
+              <a:graphicFrameLocks noChangeAspect="1"/>
+            </wp:cNvGraphicFramePr>
+            <a:graphic>
+              <a:graphicData uri="http://schemas.openxmlformats.org/drawingml/2006/picture">
+                <pic:pic>
+                  <pic:nvPicPr>
+                    <pic:cNvPr id="0" name="figure_06b_confusion_eurosat.png"/>
+                    <pic:cNvPicPr/>
+                  </pic:nvPicPr>
+                  <pic:blipFill>
+                    <a:blip r:embed="rId18"/>
+                    <a:stretch>
+                      <a:fillRect/>
+                    </a:stretch>
+                  </pic:blipFill>
+                  <pic:spPr>
+                    <a:xfrm>
+                      <a:off x="0" y="0"/>
+                      <a:ext cx="4983480" cy="4399718"/>
+                    </a:xfrm>
+                    <a:prstGeom prst="rect"/>
+                  </pic:spPr>
+                </pic:pic>
+              </a:graphicData>
+            </a:graphic>
+          </wp:inline>
+        </w:drawing>
+      </w:r>
+    </w:p>
+    <w:p>
+      <w:pPr>
+        <w:keepLines/>
+        <w:spacing w:after="80"/>
+        <w:jc w:val="center"/>
+      </w:pPr>
       <w:r>
         <w:rPr>
           <w:rFonts w:ascii="Times New Roman" w:hAnsi="Times New Roman"/>
           <w:sz w:val="17"/>
         </w:rPr>
-        <w:t>Row-normalized test confusion matrices selected without test-performance access; every cell, including 0.00 values, is generated from prediction-level notebook outputs</w:t>
+        <w:t>Figure 6b Row-normalized EuroSAT test confusion matrix for validation-selected SLP-6 with logistic regression</w:t>
+      </w:r>
+    </w:p>
+    <w:p>
+      <w:pPr>
+        <w:sectPr>
+          <w:type w:val="continuous"/>
+          <w:pgSz w:w="11906" w:h="15817"/>
+          <w:pgMar w:top="677" w:right="1020" w:bottom="691" w:left="1020" w:header="720" w:footer="720" w:gutter="0"/>
+          <w:cols w:space="0" w:num="1"/>
+          <w:docGrid w:linePitch="360"/>
+        </w:sectPr>
+      </w:pPr>
+    </w:p>
+    <w:p>
+      <w:pPr>
+        <w:sectPr>
+          <w:type w:val="continuous"/>
+          <w:pgSz w:w="11906" w:h="15817"/>
+          <w:pgMar w:top="677" w:right="1020" w:bottom="691" w:left="1020" w:header="720" w:footer="720" w:gutter="0"/>
+          <w:cols w:space="300" w:num="2"/>
+          <w:docGrid w:linePitch="360"/>
+        </w:sectPr>
+      </w:pPr>
+    </w:p>
+    <w:p>
+      <w:pPr>
+        <w:jc w:val="center"/>
+      </w:pPr>
+      <w:r>
+        <w:drawing>
+          <wp:inline xmlns:a="http://schemas.openxmlformats.org/drawingml/2006/main" xmlns:pic="http://schemas.openxmlformats.org/drawingml/2006/picture">
+            <wp:extent cx="4983480" cy="4399718"/>
+            <wp:docPr id="8" name="Picture 8" title="Figure 6c Row-normalized PathMNIST test confusion matrix for validation-selected SLP-6 with RBF-SVM" descr="Figure 6c Row-normalized PathMNIST test confusion matrix for validation-selected SLP-6 with RBF-SVM"/>
+            <wp:cNvGraphicFramePr>
+              <a:graphicFrameLocks noChangeAspect="1"/>
+            </wp:cNvGraphicFramePr>
+            <a:graphic>
+              <a:graphicData uri="http://schemas.openxmlformats.org/drawingml/2006/picture">
+                <pic:pic>
+                  <pic:nvPicPr>
+                    <pic:cNvPr id="0" name="figure_06c_confusion_pathmnist.png"/>
+                    <pic:cNvPicPr/>
+                  </pic:nvPicPr>
+                  <pic:blipFill>
+                    <a:blip r:embed="rId19"/>
+                    <a:stretch>
+                      <a:fillRect/>
+                    </a:stretch>
+                  </pic:blipFill>
+                  <pic:spPr>
+                    <a:xfrm>
+                      <a:off x="0" y="0"/>
+                      <a:ext cx="4983480" cy="4399718"/>
+                    </a:xfrm>
+                    <a:prstGeom prst="rect"/>
+                  </pic:spPr>
+                </pic:pic>
+              </a:graphicData>
+            </a:graphic>
+          </wp:inline>
+        </w:drawing>
+      </w:r>
+    </w:p>
+    <w:p>
+      <w:pPr>
+        <w:keepLines/>
+        <w:spacing w:after="80"/>
+        <w:jc w:val="center"/>
+      </w:pPr>
+      <w:r>
+        <w:rPr>
+          <w:rFonts w:ascii="Times New Roman" w:hAnsi="Times New Roman"/>
+          <w:sz w:val="17"/>
+        </w:rPr>
+        <w:t>Figure 6c Row-normalized PathMNIST test confusion matrix for validation-selected SLP-6 with RBF-SVM</w:t>
       </w:r>
     </w:p>
     <w:p>
@@ -17902,7 +18044,7 @@
         <w:drawing>
           <wp:inline xmlns:a="http://schemas.openxmlformats.org/drawingml/2006/main" xmlns:pic="http://schemas.openxmlformats.org/drawingml/2006/picture">
             <wp:extent cx="6080760" cy="1807749"/>
-            <wp:docPr id="7" name="Picture 7" title="Figure 7 Reliability diagrams for validation-selected configurations" descr="Figure 7 Reliability diagrams for validation-selected configurations"/>
+            <wp:docPr id="9" name="Picture 9" title="Figure 7 Reliability diagrams for validation-selected configurations" descr="Figure 7 Reliability diagrams for validation-selected configurations"/>
             <wp:cNvGraphicFramePr>
               <a:graphicFrameLocks noChangeAspect="1"/>
             </wp:cNvGraphicFramePr>
@@ -17914,7 +18056,7 @@
                     <pic:cNvPicPr/>
                   </pic:nvPicPr>
                   <pic:blipFill>
-                    <a:blip r:embed="rId18"/>
+                    <a:blip r:embed="rId20"/>
                     <a:stretch>
                       <a:fillRect/>
                     </a:stretch>
@@ -18006,7 +18148,7 @@
         <w:drawing>
           <wp:inline xmlns:a="http://schemas.openxmlformats.org/drawingml/2006/main" xmlns:pic="http://schemas.openxmlformats.org/drawingml/2006/picture">
             <wp:extent cx="6080760" cy="3192605"/>
-            <wp:docPr id="8" name="Picture 8" title="Figure 8 Mean observed fit time by head and dataset" descr="Figure 8 Mean observed fit time by head and dataset"/>
+            <wp:docPr id="10" name="Picture 10" title="Figure 8 Mean observed fit time by head and dataset" descr="Figure 8 Mean observed fit time by head and dataset"/>
             <wp:cNvGraphicFramePr>
               <a:graphicFrameLocks noChangeAspect="1"/>
             </wp:cNvGraphicFramePr>
@@ -18018,7 +18160,7 @@
                     <pic:cNvPicPr/>
                   </pic:nvPicPr>
                   <pic:blipFill>
-                    <a:blip r:embed="rId19"/>
+                    <a:blip r:embed="rId21"/>
                     <a:stretch>
                       <a:fillRect/>
                     </a:stretch>

</xml_diff>

<commit_message>
Match QMI paragraph and reference formatting
</commit_message>
<xml_diff>
--- a/article/Article09_QMI_Submission_Final.docx
+++ b/article/Article09_QMI_Submission_Final.docx
@@ -136,7 +136,8 @@
     <w:p>
       <w:pPr>
         <w:spacing w:line="240" w:lineRule="auto" w:after="60"/>
-        <w:ind w:firstLine="360"/>
+        <w:ind w:firstLine="0"/>
+        <w:jc w:val="both"/>
       </w:pPr>
       <w:r>
         <w:rPr>
@@ -186,6 +187,7 @@
       <w:pPr>
         <w:spacing w:line="240" w:lineRule="auto" w:after="60"/>
         <w:ind w:firstLine="360"/>
+        <w:jc w:val="both"/>
       </w:pPr>
       <w:r>
         <w:rPr>
@@ -199,6 +201,7 @@
       <w:pPr>
         <w:spacing w:line="240" w:lineRule="auto" w:after="60"/>
         <w:ind w:firstLine="360"/>
+        <w:jc w:val="both"/>
       </w:pPr>
       <w:r>
         <w:rPr>
@@ -316,6 +319,7 @@
       <w:pPr>
         <w:spacing w:line="240" w:lineRule="auto" w:after="60"/>
         <w:ind w:firstLine="360"/>
+        <w:jc w:val="both"/>
       </w:pPr>
       <w:r>
         <w:rPr>
@@ -433,6 +437,7 @@
       <w:pPr>
         <w:spacing w:line="240" w:lineRule="auto" w:after="60"/>
         <w:ind w:firstLine="360"/>
+        <w:jc w:val="both"/>
       </w:pPr>
       <w:r>
         <w:rPr>
@@ -446,6 +451,7 @@
       <w:pPr>
         <w:spacing w:line="240" w:lineRule="auto" w:after="60"/>
         <w:ind w:firstLine="360"/>
+        <w:jc w:val="both"/>
       </w:pPr>
       <w:r>
         <w:rPr>
@@ -1598,6 +1604,7 @@
       <w:pPr>
         <w:spacing w:line="240" w:lineRule="auto" w:after="60"/>
         <w:ind w:firstLine="360"/>
+        <w:jc w:val="both"/>
       </w:pPr>
       <w:r>
         <w:rPr>
@@ -2807,6 +2814,7 @@
       <w:pPr>
         <w:spacing w:line="240" w:lineRule="auto" w:after="60"/>
         <w:ind w:firstLine="360"/>
+        <w:jc w:val="both"/>
       </w:pPr>
       <w:r>
         <w:rPr>
@@ -2846,6 +2854,7 @@
       <w:pPr>
         <w:spacing w:line="240" w:lineRule="auto" w:after="60"/>
         <w:ind w:firstLine="360"/>
+        <w:jc w:val="both"/>
       </w:pPr>
       <w:r>
         <w:rPr>
@@ -2988,6 +2997,7 @@
       <w:pPr>
         <w:spacing w:line="240" w:lineRule="auto" w:after="60"/>
         <w:ind w:firstLine="360"/>
+        <w:jc w:val="both"/>
       </w:pPr>
       <w:r>
         <w:rPr>
@@ -3013,6 +3023,7 @@
       <w:pPr>
         <w:spacing w:line="240" w:lineRule="auto" w:after="60"/>
         <w:ind w:firstLine="360"/>
+        <w:jc w:val="both"/>
       </w:pPr>
       <w:r>
         <w:rPr>
@@ -3034,6 +3045,7 @@
       <w:pPr>
         <w:spacing w:line="240" w:lineRule="auto" w:after="60"/>
         <w:ind w:firstLine="360"/>
+        <w:jc w:val="both"/>
       </w:pPr>
       <w:r>
         <w:rPr>
@@ -3047,6 +3059,7 @@
       <w:pPr>
         <w:spacing w:line="240" w:lineRule="auto" w:after="60"/>
         <w:ind w:firstLine="360"/>
+        <w:jc w:val="both"/>
       </w:pPr>
       <w:r>
         <w:rPr>
@@ -3144,6 +3157,7 @@
       <w:pPr>
         <w:spacing w:line="240" w:lineRule="auto" w:after="60"/>
         <w:ind w:firstLine="360"/>
+        <w:jc w:val="both"/>
       </w:pPr>
       <w:r>
         <w:rPr>
@@ -11876,6 +11890,7 @@
       <w:pPr>
         <w:spacing w:line="240" w:lineRule="auto" w:after="60"/>
         <w:ind w:firstLine="360"/>
+        <w:jc w:val="both"/>
       </w:pPr>
       <w:r>
         <w:rPr>
@@ -17604,6 +17619,7 @@
       <w:pPr>
         <w:spacing w:line="240" w:lineRule="auto" w:after="60"/>
         <w:ind w:firstLine="360"/>
+        <w:jc w:val="both"/>
       </w:pPr>
       <w:r>
         <w:rPr>
@@ -17708,6 +17724,7 @@
       <w:pPr>
         <w:spacing w:line="240" w:lineRule="auto" w:after="60"/>
         <w:ind w:firstLine="360"/>
+        <w:jc w:val="both"/>
       </w:pPr>
       <w:r>
         <w:rPr>
@@ -18120,6 +18137,7 @@
       <w:pPr>
         <w:spacing w:line="240" w:lineRule="auto" w:after="60"/>
         <w:ind w:firstLine="360"/>
+        <w:jc w:val="both"/>
       </w:pPr>
       <w:r>
         <w:rPr>
@@ -18224,6 +18242,7 @@
       <w:pPr>
         <w:spacing w:line="240" w:lineRule="auto" w:after="60"/>
         <w:ind w:firstLine="360"/>
+        <w:jc w:val="both"/>
       </w:pPr>
       <w:r>
         <w:rPr>
@@ -18237,6 +18256,7 @@
       <w:pPr>
         <w:spacing w:line="240" w:lineRule="auto" w:after="60"/>
         <w:ind w:firstLine="360"/>
+        <w:jc w:val="both"/>
       </w:pPr>
       <w:r>
         <w:rPr>
@@ -18250,6 +18270,7 @@
       <w:pPr>
         <w:spacing w:line="240" w:lineRule="auto" w:after="60"/>
         <w:ind w:firstLine="360"/>
+        <w:jc w:val="both"/>
       </w:pPr>
       <w:r>
         <w:rPr>
@@ -18341,6 +18362,7 @@
       <w:pPr>
         <w:spacing w:line="240" w:lineRule="auto" w:after="60"/>
         <w:ind w:firstLine="360"/>
+        <w:jc w:val="both"/>
       </w:pPr>
       <w:r>
         <w:rPr>
@@ -18354,6 +18376,7 @@
       <w:pPr>
         <w:spacing w:line="240" w:lineRule="auto" w:after="60"/>
         <w:ind w:firstLine="360"/>
+        <w:jc w:val="both"/>
       </w:pPr>
       <w:r>
         <w:rPr>
@@ -18366,7 +18389,8 @@
     <w:p>
       <w:pPr>
         <w:spacing w:line="240" w:lineRule="auto" w:after="60"/>
-        <w:ind w:firstLine="360"/>
+        <w:ind w:firstLine="0"/>
+        <w:jc w:val="both"/>
       </w:pPr>
       <w:r>
         <w:rPr>
@@ -18387,7 +18411,8 @@
     <w:p>
       <w:pPr>
         <w:spacing w:line="240" w:lineRule="auto" w:after="60"/>
-        <w:ind w:firstLine="360"/>
+        <w:ind w:firstLine="0"/>
+        <w:jc w:val="both"/>
       </w:pPr>
       <w:r>
         <w:rPr>
@@ -18408,7 +18433,8 @@
     <w:p>
       <w:pPr>
         <w:spacing w:line="240" w:lineRule="auto" w:after="60"/>
-        <w:ind w:firstLine="360"/>
+        <w:ind w:firstLine="0"/>
+        <w:jc w:val="both"/>
       </w:pPr>
       <w:r>
         <w:rPr>
@@ -18429,7 +18455,8 @@
     <w:p>
       <w:pPr>
         <w:spacing w:line="240" w:lineRule="auto" w:after="60"/>
-        <w:ind w:firstLine="360"/>
+        <w:ind w:firstLine="0"/>
+        <w:jc w:val="both"/>
       </w:pPr>
       <w:r>
         <w:rPr>
@@ -18450,7 +18477,8 @@
     <w:p>
       <w:pPr>
         <w:spacing w:line="240" w:lineRule="auto" w:after="60"/>
-        <w:ind w:firstLine="360"/>
+        <w:ind w:firstLine="0"/>
+        <w:jc w:val="both"/>
       </w:pPr>
       <w:r>
         <w:rPr>
@@ -18471,7 +18499,8 @@
     <w:p>
       <w:pPr>
         <w:spacing w:line="240" w:lineRule="auto" w:after="60"/>
-        <w:ind w:firstLine="360"/>
+        <w:ind w:firstLine="0"/>
+        <w:jc w:val="both"/>
       </w:pPr>
       <w:r>
         <w:rPr>
@@ -18500,7 +18529,8 @@
     <w:p>
       <w:pPr>
         <w:spacing w:line="240" w:lineRule="auto" w:after="60"/>
-        <w:ind w:firstLine="360"/>
+        <w:ind w:firstLine="0"/>
+        <w:jc w:val="both"/>
       </w:pPr>
       <w:r>
         <w:rPr>
@@ -18521,7 +18551,8 @@
     <w:p>
       <w:pPr>
         <w:spacing w:line="240" w:lineRule="auto" w:after="60"/>
-        <w:ind w:firstLine="360"/>
+        <w:ind w:firstLine="0"/>
+        <w:jc w:val="both"/>
       </w:pPr>
       <w:r>
         <w:rPr>
@@ -18549,8 +18580,10 @@
     </w:p>
     <w:p>
       <w:pPr>
-        <w:spacing w:after="0"/>
+        <w:widowControl/>
+        <w:spacing w:line="240" w:lineRule="auto" w:before="0" w:after="0"/>
         <w:ind w:left="259" w:hanging="259"/>
+        <w:jc w:val="both"/>
       </w:pPr>
       <w:r>
         <w:fldChar w:fldCharType="begin" w:dirty="true"/>
@@ -18566,232 +18599,670 @@
           <w:rFonts w:ascii="Times New Roman" w:hAnsi="Times New Roman"/>
           <w:sz w:val="17"/>
         </w:rPr>
-        <w:t>Abbas A, Sutter D, Zoufal C, Lucchi A, Figalli A, Woerner S (2021) The power of quantum neural networks. Nature Computational Science 1:403-409. https://doi.org/10.1038/s43588-021-00084-1</w:t>
-        <w:br/>
+        <w:t xml:space="preserve">Abbas A, Sutter D, Zoufal C, Lucchi A, Figalli A, Woerner S (2021) The power of quantum neural networks. Nat Comput Sci 1:403-409. </w:t>
       </w:r>
+      <w:hyperlink r:id="rId22">
+        <w:r>
+          <w:rPr>
+            <w:color w:val="0563C1"/>
+            <w:u w:val="single"/>
+            <w:sz w:val="17"/>
+            <w:szCs w:val="17"/>
+          </w:rPr>
+          <w:t>https://doi.org/10.1038/s43588-021-00084-1</w:t>
+        </w:r>
+      </w:hyperlink>
+    </w:p>
+    <w:p>
+      <w:pPr>
+        <w:widowControl/>
+        <w:spacing w:line="240" w:lineRule="auto" w:before="0" w:after="0"/>
+        <w:ind w:left="259" w:hanging="259"/>
+        <w:jc w:val="both"/>
+      </w:pPr>
       <w:r>
         <w:rPr>
           <w:rFonts w:ascii="Times New Roman" w:hAnsi="Times New Roman"/>
           <w:sz w:val="17"/>
         </w:rPr>
-        <w:t>Baldi P, Hornik K (1989) Neural networks and principal component analysis. Neural Networks 2(1):53-58. https://doi.org/10.1016/0893-6080(89)90014-2</w:t>
-        <w:br/>
+        <w:t xml:space="preserve">Baldi P, Hornik K (1989) Neural networks and principal component analysis. Neural Netw 2(1):53-58. </w:t>
       </w:r>
+      <w:hyperlink r:id="rId23">
+        <w:r>
+          <w:rPr>
+            <w:color w:val="0563C1"/>
+            <w:u w:val="single"/>
+            <w:sz w:val="17"/>
+            <w:szCs w:val="17"/>
+          </w:rPr>
+          <w:t>https://doi.org/10.1016/0893-6080(89)90014-2</w:t>
+        </w:r>
+      </w:hyperlink>
+    </w:p>
+    <w:p>
+      <w:pPr>
+        <w:widowControl/>
+        <w:spacing w:line="240" w:lineRule="auto" w:before="0" w:after="0"/>
+        <w:ind w:left="259" w:hanging="259"/>
+        <w:jc w:val="both"/>
+      </w:pPr>
       <w:r>
         <w:rPr>
           <w:rFonts w:ascii="Times New Roman" w:hAnsi="Times New Roman"/>
           <w:sz w:val="17"/>
         </w:rPr>
-        <w:t>Caro MC, Huang HY, Cerezo M, Sharma K, Sornborger A, Cincio L, Coles PJ (2022) Generalization in quantum machine learning from few training data. Nature Communications 13:4919. https://doi.org/10.1038/s41467-022-32550-3</w:t>
-        <w:br/>
+        <w:t xml:space="preserve">Caro MC, Huang HY, Cerezo M, Sharma K, Sornborger A, Cincio L, Coles PJ (2022) Generalization in quantum machine learning from few training data. Nat Commun 13:4919. </w:t>
       </w:r>
+      <w:hyperlink r:id="rId24">
+        <w:r>
+          <w:rPr>
+            <w:color w:val="0563C1"/>
+            <w:u w:val="single"/>
+            <w:sz w:val="17"/>
+            <w:szCs w:val="17"/>
+          </w:rPr>
+          <w:t>https://doi.org/10.1038/s41467-022-32550-3</w:t>
+        </w:r>
+      </w:hyperlink>
+    </w:p>
+    <w:p>
+      <w:pPr>
+        <w:widowControl/>
+        <w:spacing w:line="240" w:lineRule="auto" w:before="0" w:after="0"/>
+        <w:ind w:left="259" w:hanging="259"/>
+        <w:jc w:val="both"/>
+      </w:pPr>
       <w:r>
         <w:rPr>
           <w:rFonts w:ascii="Times New Roman" w:hAnsi="Times New Roman"/>
           <w:sz w:val="17"/>
         </w:rPr>
-        <w:t>Cerezo M et al (2021) Variational quantum algorithms. Nature Reviews Physics 3:625-644. https://doi.org/10.1038/s42254-021-00348-9</w:t>
-        <w:br/>
+        <w:t xml:space="preserve">Cerezo M et al (2021) Variational quantum algorithms. Nat Rev Phys 3:625-644. </w:t>
       </w:r>
+      <w:hyperlink r:id="rId25">
+        <w:r>
+          <w:rPr>
+            <w:color w:val="0563C1"/>
+            <w:u w:val="single"/>
+            <w:sz w:val="17"/>
+            <w:szCs w:val="17"/>
+          </w:rPr>
+          <w:t>https://doi.org/10.1038/s42254-021-00348-9</w:t>
+        </w:r>
+      </w:hyperlink>
+    </w:p>
+    <w:p>
+      <w:pPr>
+        <w:widowControl/>
+        <w:spacing w:line="240" w:lineRule="auto" w:before="0" w:after="0"/>
+        <w:ind w:left="259" w:hanging="259"/>
+        <w:jc w:val="both"/>
+      </w:pPr>
       <w:r>
         <w:rPr>
           <w:rFonts w:ascii="Times New Roman" w:hAnsi="Times New Roman"/>
           <w:sz w:val="17"/>
         </w:rPr>
-        <w:t>Cerezo M, Verdon G, Huang HY, Cincio L, Coles PJ (2022) Challenges and opportunities in quantum machine learning. Nature Computational Science 2:567-576. https://doi.org/10.1038/s43588-022-00311-3</w:t>
-        <w:br/>
+        <w:t xml:space="preserve">Cerezo M, Verdon G, Huang HY, Cincio L, Coles PJ (2022) Challenges and opportunities in quantum machine learning. Nat Comput Sci 2:567-576. </w:t>
       </w:r>
+      <w:hyperlink r:id="rId26">
+        <w:r>
+          <w:rPr>
+            <w:color w:val="0563C1"/>
+            <w:u w:val="single"/>
+            <w:sz w:val="17"/>
+            <w:szCs w:val="17"/>
+          </w:rPr>
+          <w:t>https://doi.org/10.1038/s43588-022-00311-3</w:t>
+        </w:r>
+      </w:hyperlink>
+    </w:p>
+    <w:p>
+      <w:pPr>
+        <w:widowControl/>
+        <w:spacing w:line="240" w:lineRule="auto" w:before="0" w:after="0"/>
+        <w:ind w:left="259" w:hanging="259"/>
+        <w:jc w:val="both"/>
+      </w:pPr>
       <w:r>
         <w:rPr>
           <w:rFonts w:ascii="Times New Roman" w:hAnsi="Times New Roman"/>
           <w:sz w:val="17"/>
         </w:rPr>
-        <w:t>Demsar J (2006) Statistical comparisons of classifiers over multiple data sets. Journal of Machine Learning Research 7:1-30</w:t>
-        <w:br/>
+        <w:t>Demsar J (2006) Statistical comparisons of classifiers over multiple data sets. J Mach Learn Res 7:1-30</w:t>
       </w:r>
+    </w:p>
+    <w:p>
+      <w:pPr>
+        <w:widowControl/>
+        <w:spacing w:line="240" w:lineRule="auto" w:before="0" w:after="0"/>
+        <w:ind w:left="259" w:hanging="259"/>
+        <w:jc w:val="both"/>
+      </w:pPr>
       <w:r>
         <w:rPr>
           <w:rFonts w:ascii="Times New Roman" w:hAnsi="Times New Roman"/>
           <w:sz w:val="17"/>
         </w:rPr>
-        <w:t>Du Y, Hsieh MH, Liu T, You S, Tao D (2021) Learnability of quantum neural networks. PRX Quantum 2:040337. https://doi.org/10.1103/PRXQuantum.2.040337</w:t>
-        <w:br/>
+        <w:t xml:space="preserve">Du Y, Hsieh MH, Liu T, You S, Tao D (2021) Learnability of quantum neural networks. PRX Quantum 2:040337. </w:t>
       </w:r>
+      <w:hyperlink r:id="rId27">
+        <w:r>
+          <w:rPr>
+            <w:color w:val="0563C1"/>
+            <w:u w:val="single"/>
+            <w:sz w:val="17"/>
+            <w:szCs w:val="17"/>
+          </w:rPr>
+          <w:t>https://doi.org/10.1103/PRXQuantum.2.040337</w:t>
+        </w:r>
+      </w:hyperlink>
+    </w:p>
+    <w:p>
+      <w:pPr>
+        <w:widowControl/>
+        <w:spacing w:line="240" w:lineRule="auto" w:before="0" w:after="0"/>
+        <w:ind w:left="259" w:hanging="259"/>
+        <w:jc w:val="both"/>
+      </w:pPr>
       <w:r>
         <w:rPr>
           <w:rFonts w:ascii="Times New Roman" w:hAnsi="Times New Roman"/>
           <w:sz w:val="17"/>
         </w:rPr>
         <w:t>Efron B, Tibshirani RJ (1993) An Introduction to the Bootstrap. Chapman and Hall, New York</w:t>
-        <w:br/>
       </w:r>
+    </w:p>
+    <w:p>
+      <w:pPr>
+        <w:widowControl/>
+        <w:spacing w:line="240" w:lineRule="auto" w:before="0" w:after="0"/>
+        <w:ind w:left="259" w:hanging="259"/>
+        <w:jc w:val="both"/>
+      </w:pPr>
       <w:r>
         <w:rPr>
           <w:rFonts w:ascii="Times New Roman" w:hAnsi="Times New Roman"/>
           <w:sz w:val="17"/>
         </w:rPr>
-        <w:t>Egginger S, Sakhnenko A, Lorenz JM (2024) A hyperparameter study for quantum kernel methods. Quantum Machine Intelligence 6:44. https://doi.org/10.1007/s42484-024-00172-1</w:t>
-        <w:br/>
+        <w:t xml:space="preserve">Egginger S, Sakhnenko A, Lorenz JM (2024) A hyperparameter study for quantum kernel methods. Quantum Mach Intell 6:44. </w:t>
       </w:r>
+      <w:hyperlink r:id="rId28">
+        <w:r>
+          <w:rPr>
+            <w:color w:val="0563C1"/>
+            <w:u w:val="single"/>
+            <w:sz w:val="17"/>
+            <w:szCs w:val="17"/>
+          </w:rPr>
+          <w:t>https://doi.org/10.1007/s42484-024-00172-1</w:t>
+        </w:r>
+      </w:hyperlink>
+    </w:p>
+    <w:p>
+      <w:pPr>
+        <w:widowControl/>
+        <w:spacing w:line="240" w:lineRule="auto" w:before="0" w:after="0"/>
+        <w:ind w:left="259" w:hanging="259"/>
+        <w:jc w:val="both"/>
+      </w:pPr>
       <w:r>
         <w:rPr>
           <w:rFonts w:ascii="Times New Roman" w:hAnsi="Times New Roman"/>
           <w:sz w:val="17"/>
         </w:rPr>
-        <w:t>Gil-Fuster E, Eisert J, Bravo-Prieto C (2024) Understanding quantum machine learning also requires rethinking generalization. Nature Communications 15:2277. https://doi.org/10.1038/s41467-024-45882-z</w:t>
-        <w:br/>
+        <w:t xml:space="preserve">Gil-Fuster E, Eisert J, Bravo-Prieto C (2024) Understanding quantum machine learning also requires rethinking generalization. Nat Commun 15:2277. </w:t>
       </w:r>
+      <w:hyperlink r:id="rId29">
+        <w:r>
+          <w:rPr>
+            <w:color w:val="0563C1"/>
+            <w:u w:val="single"/>
+            <w:sz w:val="17"/>
+            <w:szCs w:val="17"/>
+          </w:rPr>
+          <w:t>https://doi.org/10.1038/s41467-024-45882-z</w:t>
+        </w:r>
+      </w:hyperlink>
+    </w:p>
+    <w:p>
+      <w:pPr>
+        <w:widowControl/>
+        <w:spacing w:line="240" w:lineRule="auto" w:before="0" w:after="0"/>
+        <w:ind w:left="259" w:hanging="259"/>
+        <w:jc w:val="both"/>
+      </w:pPr>
       <w:r>
         <w:rPr>
           <w:rFonts w:ascii="Times New Roman" w:hAnsi="Times New Roman"/>
           <w:sz w:val="17"/>
         </w:rPr>
-        <w:t>Gneiting T, Raftery AE (2007) Strictly proper scoring rules, prediction, and estimation. Journal of the American Statistical Association 102(477):359-378. https://doi.org/10.1198/016214506000001437</w:t>
-        <w:br/>
+        <w:t xml:space="preserve">Gneiting T, Raftery AE (2007) Strictly proper scoring rules, prediction, and estimation. J Am Stat Assoc 102(477):359-378. </w:t>
       </w:r>
+      <w:hyperlink r:id="rId30">
+        <w:r>
+          <w:rPr>
+            <w:color w:val="0563C1"/>
+            <w:u w:val="single"/>
+            <w:sz w:val="17"/>
+            <w:szCs w:val="17"/>
+          </w:rPr>
+          <w:t>https://doi.org/10.1198/016214506000001437</w:t>
+        </w:r>
+      </w:hyperlink>
+    </w:p>
+    <w:p>
+      <w:pPr>
+        <w:widowControl/>
+        <w:spacing w:line="240" w:lineRule="auto" w:before="0" w:after="0"/>
+        <w:ind w:left="259" w:hanging="259"/>
+        <w:jc w:val="both"/>
+      </w:pPr>
       <w:r>
         <w:rPr>
           <w:rFonts w:ascii="Times New Roman" w:hAnsi="Times New Roman"/>
           <w:sz w:val="17"/>
         </w:rPr>
-        <w:t>Goldberger J, Hinton GE, Roweis S, Salakhutdinov RR (2004) Neighbourhood components analysis. Advances in Neural Information Processing Systems 17</w:t>
-        <w:br/>
+        <w:t>Goldberger J, Hinton GE, Roweis S, Salakhutdinov RR (2004) Neighbourhood components analysis. Adv Neural Inf Process Syst 17</w:t>
       </w:r>
+    </w:p>
+    <w:p>
+      <w:pPr>
+        <w:widowControl/>
+        <w:spacing w:line="240" w:lineRule="auto" w:before="0" w:after="0"/>
+        <w:ind w:left="259" w:hanging="259"/>
+        <w:jc w:val="both"/>
+      </w:pPr>
       <w:r>
         <w:rPr>
           <w:rFonts w:ascii="Times New Roman" w:hAnsi="Times New Roman"/>
           <w:sz w:val="17"/>
         </w:rPr>
         <w:t>Guo C, Pleiss G, Sun Y, Weinberger KQ (2017) On calibration of modern neural networks. Proceedings of the 34th International Conference on Machine Learning, pp 1321-1330</w:t>
-        <w:br/>
       </w:r>
+    </w:p>
+    <w:p>
+      <w:pPr>
+        <w:widowControl/>
+        <w:spacing w:line="240" w:lineRule="auto" w:before="0" w:after="0"/>
+        <w:ind w:left="259" w:hanging="259"/>
+        <w:jc w:val="both"/>
+      </w:pPr>
       <w:r>
         <w:rPr>
           <w:rFonts w:ascii="Times New Roman" w:hAnsi="Times New Roman"/>
           <w:sz w:val="17"/>
         </w:rPr>
-        <w:t>Havlicek V et al (2019) Supervised learning with quantum-enhanced feature spaces. Nature 567:209-212. https://doi.org/10.1038/s41586-019-0980-2</w:t>
-        <w:br/>
+        <w:t xml:space="preserve">Havlicek V et al (2019) Supervised learning with quantum-enhanced feature spaces. Nature 567:209-212. </w:t>
       </w:r>
+      <w:hyperlink r:id="rId31">
+        <w:r>
+          <w:rPr>
+            <w:color w:val="0563C1"/>
+            <w:u w:val="single"/>
+            <w:sz w:val="17"/>
+            <w:szCs w:val="17"/>
+          </w:rPr>
+          <w:t>https://doi.org/10.1038/s41586-019-0980-2</w:t>
+        </w:r>
+      </w:hyperlink>
+    </w:p>
+    <w:p>
+      <w:pPr>
+        <w:widowControl/>
+        <w:spacing w:line="240" w:lineRule="auto" w:before="0" w:after="0"/>
+        <w:ind w:left="259" w:hanging="259"/>
+        <w:jc w:val="both"/>
+      </w:pPr>
       <w:r>
         <w:rPr>
           <w:rFonts w:ascii="Times New Roman" w:hAnsi="Times New Roman"/>
           <w:sz w:val="17"/>
         </w:rPr>
-        <w:t>Helber P, Bischke B, Dengel A, Borth D (2019) EuroSAT: A novel dataset and deep learning benchmark for land use and land cover classification. IEEE Journal of Selected Topics in Applied Earth Observations and Remote Sensing 12(7):2217-2226. https://doi.org/10.1109/JSTARS.2019.2918242</w:t>
-        <w:br/>
+        <w:t xml:space="preserve">Helber P, Bischke B, Dengel A, Borth D (2019) EuroSAT: A novel dataset and deep learning benchmark for land use and land cover classification. IEEE J Sel Top Appl Earth Obs Remote Sens 12(7):2217-2226. </w:t>
       </w:r>
+      <w:hyperlink r:id="rId32">
+        <w:r>
+          <w:rPr>
+            <w:color w:val="0563C1"/>
+            <w:u w:val="single"/>
+            <w:sz w:val="17"/>
+            <w:szCs w:val="17"/>
+          </w:rPr>
+          <w:t>https://doi.org/10.1109/JSTARS.2019.2918242</w:t>
+        </w:r>
+      </w:hyperlink>
+    </w:p>
+    <w:p>
+      <w:pPr>
+        <w:widowControl/>
+        <w:spacing w:line="240" w:lineRule="auto" w:before="0" w:after="0"/>
+        <w:ind w:left="259" w:hanging="259"/>
+        <w:jc w:val="both"/>
+      </w:pPr>
       <w:r>
         <w:rPr>
           <w:rFonts w:ascii="Times New Roman" w:hAnsi="Times New Roman"/>
           <w:sz w:val="17"/>
         </w:rPr>
-        <w:t>Holm S (1979) A simple sequentially rejective multiple test procedure. Scandinavian Journal of Statistics 6(2):65-70</w:t>
-        <w:br/>
+        <w:t>Holm S (1979) A simple sequentially rejective multiple test procedure. Scand J Stat 6(2):65-70</w:t>
       </w:r>
+    </w:p>
+    <w:p>
+      <w:pPr>
+        <w:widowControl/>
+        <w:spacing w:line="240" w:lineRule="auto" w:before="0" w:after="0"/>
+        <w:ind w:left="259" w:hanging="259"/>
+        <w:jc w:val="both"/>
+      </w:pPr>
       <w:r>
         <w:rPr>
           <w:rFonts w:ascii="Times New Roman" w:hAnsi="Times New Roman"/>
           <w:sz w:val="17"/>
         </w:rPr>
-        <w:t>Huang HY, Broughton M, Mohseni M, Babbush R, Boixo S, Neven H, McClean JR (2021) Power of data in quantum machine learning. Nature Communications 12:2631. https://doi.org/10.1038/s41467-021-22539-9</w:t>
-        <w:br/>
+        <w:t xml:space="preserve">Huang HY, Broughton M, Mohseni M, Babbush R, Boixo S, Neven H, McClean JR (2021) Power of data in quantum machine learning. Nat Commun 12:2631. </w:t>
       </w:r>
+      <w:hyperlink r:id="rId33">
+        <w:r>
+          <w:rPr>
+            <w:color w:val="0563C1"/>
+            <w:u w:val="single"/>
+            <w:sz w:val="17"/>
+            <w:szCs w:val="17"/>
+          </w:rPr>
+          <w:t>https://doi.org/10.1038/s41467-021-22539-9</w:t>
+        </w:r>
+      </w:hyperlink>
+    </w:p>
+    <w:p>
+      <w:pPr>
+        <w:widowControl/>
+        <w:spacing w:line="240" w:lineRule="auto" w:before="0" w:after="0"/>
+        <w:ind w:left="259" w:hanging="259"/>
+        <w:jc w:val="both"/>
+      </w:pPr>
       <w:r>
         <w:rPr>
           <w:rFonts w:ascii="Times New Roman" w:hAnsi="Times New Roman"/>
           <w:sz w:val="17"/>
         </w:rPr>
         <w:t>Krizhevsky A (2009) Learning multiple layers of features from tiny images. Technical report, University of Toronto</w:t>
-        <w:br/>
       </w:r>
+    </w:p>
+    <w:p>
+      <w:pPr>
+        <w:widowControl/>
+        <w:spacing w:line="240" w:lineRule="auto" w:before="0" w:after="0"/>
+        <w:ind w:left="259" w:hanging="259"/>
+        <w:jc w:val="both"/>
+      </w:pPr>
       <w:r>
         <w:rPr>
           <w:rFonts w:ascii="Times New Roman" w:hAnsi="Times New Roman"/>
           <w:sz w:val="17"/>
         </w:rPr>
-        <w:t>Mangini S, Marruzzo A, Piantanida M, Gerace D, Bajoni D, Macchiavello C (2022) Quantum neural network autoencoder and classifier applied to an industrial case study. Quantum Machine Intelligence 4:13. https://doi.org/10.1007/s42484-022-00070-4</w:t>
-        <w:br/>
+        <w:t xml:space="preserve">Mangini S, Marruzzo A, Piantanida M, Gerace D, Bajoni D, Macchiavello C (2022) Quantum neural network autoencoder and classifier applied to an industrial case study. Quantum Mach Intell 4:13. </w:t>
       </w:r>
+      <w:hyperlink r:id="rId34">
+        <w:r>
+          <w:rPr>
+            <w:color w:val="0563C1"/>
+            <w:u w:val="single"/>
+            <w:sz w:val="17"/>
+            <w:szCs w:val="17"/>
+          </w:rPr>
+          <w:t>https://doi.org/10.1007/s42484-022-00070-4</w:t>
+        </w:r>
+      </w:hyperlink>
+    </w:p>
+    <w:p>
+      <w:pPr>
+        <w:widowControl/>
+        <w:spacing w:line="240" w:lineRule="auto" w:before="0" w:after="0"/>
+        <w:ind w:left="259" w:hanging="259"/>
+        <w:jc w:val="both"/>
+      </w:pPr>
       <w:r>
         <w:rPr>
           <w:rFonts w:ascii="Times New Roman" w:hAnsi="Times New Roman"/>
           <w:sz w:val="17"/>
         </w:rPr>
-        <w:t>Mari A, Bromley TR, Izaac J, Schuld M, Killoran N (2020) Transfer learning in hybrid classical-quantum neural networks. Quantum 4:340. https://doi.org/10.22331/q-2020-10-09-340</w:t>
-        <w:br/>
+        <w:t xml:space="preserve">Mari A, Bromley TR, Izaac J, Schuld M, Killoran N (2020) Transfer learning in hybrid classical-quantum neural networks. Quantum 4:340. </w:t>
       </w:r>
+      <w:hyperlink r:id="rId35">
+        <w:r>
+          <w:rPr>
+            <w:color w:val="0563C1"/>
+            <w:u w:val="single"/>
+            <w:sz w:val="17"/>
+            <w:szCs w:val="17"/>
+          </w:rPr>
+          <w:t>https://doi.org/10.22331/q-2020-10-09-340</w:t>
+        </w:r>
+      </w:hyperlink>
+    </w:p>
+    <w:p>
+      <w:pPr>
+        <w:widowControl/>
+        <w:spacing w:line="240" w:lineRule="auto" w:before="0" w:after="0"/>
+        <w:ind w:left="259" w:hanging="259"/>
+        <w:jc w:val="both"/>
+      </w:pPr>
       <w:r>
         <w:rPr>
           <w:rFonts w:ascii="Times New Roman" w:hAnsi="Times New Roman"/>
           <w:sz w:val="17"/>
         </w:rPr>
-        <w:t>Odagiu P et al (2025) Learning reduced representations for quantum classifiers. Quantum Machine Intelligence 7:113. https://doi.org/10.1007/s42484-025-00331-y</w:t>
-        <w:br/>
+        <w:t xml:space="preserve">Odagiu P et al (2025) Learning reduced representations for quantum classifiers. Quantum Mach Intell 7:113. </w:t>
       </w:r>
+      <w:hyperlink r:id="rId36">
+        <w:r>
+          <w:rPr>
+            <w:color w:val="0563C1"/>
+            <w:u w:val="single"/>
+            <w:sz w:val="17"/>
+            <w:szCs w:val="17"/>
+          </w:rPr>
+          <w:t>https://doi.org/10.1007/s42484-025-00331-y</w:t>
+        </w:r>
+      </w:hyperlink>
+    </w:p>
+    <w:p>
+      <w:pPr>
+        <w:widowControl/>
+        <w:spacing w:line="240" w:lineRule="auto" w:before="0" w:after="0"/>
+        <w:ind w:left="259" w:hanging="259"/>
+        <w:jc w:val="both"/>
+      </w:pPr>
       <w:r>
         <w:rPr>
           <w:rFonts w:ascii="Times New Roman" w:hAnsi="Times New Roman"/>
           <w:sz w:val="17"/>
         </w:rPr>
-        <w:t>Oquab M et al (2024) DINOv2: Learning robust visual features without supervision. Transactions on Machine Learning Research</w:t>
-        <w:br/>
+        <w:t>Oquab M et al (2024) DINOv2: Learning robust visual features without supervision. Trans Mach Learn Res</w:t>
       </w:r>
+    </w:p>
+    <w:p>
+      <w:pPr>
+        <w:widowControl/>
+        <w:spacing w:line="240" w:lineRule="auto" w:before="0" w:after="0"/>
+        <w:ind w:left="259" w:hanging="259"/>
+        <w:jc w:val="both"/>
+      </w:pPr>
       <w:r>
         <w:rPr>
           <w:rFonts w:ascii="Times New Roman" w:hAnsi="Times New Roman"/>
           <w:sz w:val="17"/>
         </w:rPr>
-        <w:t>Perez-Salinas A, Cervera-Lierta A, Gil-Fuster E, Latorre JI (2020) Data re-uploading for a universal quantum classifier. Quantum 4:226. https://doi.org/10.22331/q-2020-02-06-226</w:t>
-        <w:br/>
+        <w:t xml:space="preserve">Perez-Salinas A, Cervera-Lierta A, Gil-Fuster E, Latorre JI (2020) Data re-uploading for a universal quantum classifier. Quantum 4:226. </w:t>
       </w:r>
+      <w:hyperlink r:id="rId37">
+        <w:r>
+          <w:rPr>
+            <w:color w:val="0563C1"/>
+            <w:u w:val="single"/>
+            <w:sz w:val="17"/>
+            <w:szCs w:val="17"/>
+          </w:rPr>
+          <w:t>https://doi.org/10.22331/q-2020-02-06-226</w:t>
+        </w:r>
+      </w:hyperlink>
+    </w:p>
+    <w:p>
+      <w:pPr>
+        <w:widowControl/>
+        <w:spacing w:line="240" w:lineRule="auto" w:before="0" w:after="0"/>
+        <w:ind w:left="259" w:hanging="259"/>
+        <w:jc w:val="both"/>
+      </w:pPr>
       <w:r>
         <w:rPr>
           <w:rFonts w:ascii="Times New Roman" w:hAnsi="Times New Roman"/>
           <w:sz w:val="17"/>
         </w:rPr>
-        <w:t>Schnabel J, Roth M (2025) Quantum kernel methods under scrutiny: a benchmarking study. Quantum Machine Intelligence 7:58. https://doi.org/10.1007/s42484-025-00273-5</w:t>
-        <w:br/>
+        <w:t xml:space="preserve">Schnabel J, Roth M (2025) Quantum kernel methods under scrutiny: a benchmarking study. Quantum Mach Intell 7:58. </w:t>
       </w:r>
+      <w:hyperlink r:id="rId38">
+        <w:r>
+          <w:rPr>
+            <w:color w:val="0563C1"/>
+            <w:u w:val="single"/>
+            <w:sz w:val="17"/>
+            <w:szCs w:val="17"/>
+          </w:rPr>
+          <w:t>https://doi.org/10.1007/s42484-025-00273-5</w:t>
+        </w:r>
+      </w:hyperlink>
+    </w:p>
+    <w:p>
+      <w:pPr>
+        <w:widowControl/>
+        <w:spacing w:line="240" w:lineRule="auto" w:before="0" w:after="0"/>
+        <w:ind w:left="259" w:hanging="259"/>
+        <w:jc w:val="both"/>
+      </w:pPr>
       <w:r>
         <w:rPr>
           <w:rFonts w:ascii="Times New Roman" w:hAnsi="Times New Roman"/>
           <w:sz w:val="17"/>
         </w:rPr>
-        <w:t>Schuld M, Killoran N (2019) Quantum machine learning in feature Hilbert spaces. Physical Review Letters 122:040504. https://doi.org/10.1103/PhysRevLett.122.040504</w:t>
-        <w:br/>
+        <w:t xml:space="preserve">Schuld M, Killoran N (2019) Quantum machine learning in feature Hilbert spaces. Phys Rev Lett 122:040504. </w:t>
       </w:r>
+      <w:hyperlink r:id="rId39">
+        <w:r>
+          <w:rPr>
+            <w:color w:val="0563C1"/>
+            <w:u w:val="single"/>
+            <w:sz w:val="17"/>
+            <w:szCs w:val="17"/>
+          </w:rPr>
+          <w:t>https://doi.org/10.1103/PhysRevLett.122.040504</w:t>
+        </w:r>
+      </w:hyperlink>
+    </w:p>
+    <w:p>
+      <w:pPr>
+        <w:widowControl/>
+        <w:spacing w:line="240" w:lineRule="auto" w:before="0" w:after="0"/>
+        <w:ind w:left="259" w:hanging="259"/>
+        <w:jc w:val="both"/>
+      </w:pPr>
       <w:r>
         <w:rPr>
           <w:rFonts w:ascii="Times New Roman" w:hAnsi="Times New Roman"/>
           <w:sz w:val="17"/>
         </w:rPr>
-        <w:t>Schuld M, Sweke R, Meyer JJ (2021) Effect of data encoding on the expressive power of variational quantum-machine-learning models. Physical Review A 103:032430. https://doi.org/10.1103/PhysRevA.103.032430</w:t>
-        <w:br/>
+        <w:t xml:space="preserve">Schuld M, Sweke R, Meyer JJ (2021) Effect of data encoding on the expressive power of variational quantum-machine-learning models. Phys Rev A 103:032430. </w:t>
       </w:r>
+      <w:hyperlink r:id="rId40">
+        <w:r>
+          <w:rPr>
+            <w:color w:val="0563C1"/>
+            <w:u w:val="single"/>
+            <w:sz w:val="17"/>
+            <w:szCs w:val="17"/>
+          </w:rPr>
+          <w:t>https://doi.org/10.1103/PhysRevA.103.032430</w:t>
+        </w:r>
+      </w:hyperlink>
+    </w:p>
+    <w:p>
+      <w:pPr>
+        <w:widowControl/>
+        <w:spacing w:line="240" w:lineRule="auto" w:before="0" w:after="0"/>
+        <w:ind w:left="259" w:hanging="259"/>
+        <w:jc w:val="both"/>
+      </w:pPr>
       <w:r>
         <w:rPr>
           <w:rFonts w:ascii="Times New Roman" w:hAnsi="Times New Roman"/>
           <w:sz w:val="17"/>
         </w:rPr>
-        <w:t>Thanasilp S, Wang S, Cerezo M, Holmes Z (2024) Exponential concentration in quantum kernel methods. Nature Communications 15:5200. https://doi.org/10.1038/s41467-024-49287-w</w:t>
-        <w:br/>
+        <w:t xml:space="preserve">Thanasilp S, Wang S, Cerezo M, Holmes Z (2024) Exponential concentration in quantum kernel methods. Nat Commun 15:5200. </w:t>
       </w:r>
+      <w:hyperlink r:id="rId41">
+        <w:r>
+          <w:rPr>
+            <w:color w:val="0563C1"/>
+            <w:u w:val="single"/>
+            <w:sz w:val="17"/>
+            <w:szCs w:val="17"/>
+          </w:rPr>
+          <w:t>https://doi.org/10.1038/s41467-024-49287-w</w:t>
+        </w:r>
+      </w:hyperlink>
+    </w:p>
+    <w:p>
+      <w:pPr>
+        <w:widowControl/>
+        <w:spacing w:line="240" w:lineRule="auto" w:before="0" w:after="0"/>
+        <w:ind w:left="259" w:hanging="259"/>
+        <w:jc w:val="both"/>
+      </w:pPr>
       <w:r>
         <w:rPr>
           <w:rFonts w:ascii="Times New Roman" w:hAnsi="Times New Roman"/>
           <w:sz w:val="17"/>
         </w:rPr>
-        <w:t>Wang P, Myers CR, Hollenberg LCL, Parampalli U (2025) Quantum Hamiltonian embedding of images for data reuploading classifiers. Quantum Machine Intelligence 7:35. https://doi.org/10.1007/s42484-025-00247-7</w:t>
-        <w:br/>
+        <w:t xml:space="preserve">Wang P, Myers CR, Hollenberg LCL, Parampalli U (2025) Quantum Hamiltonian embedding of images for data reuploading classifiers. Quantum Mach Intell 7:35. </w:t>
       </w:r>
+      <w:hyperlink r:id="rId42">
+        <w:r>
+          <w:rPr>
+            <w:color w:val="0563C1"/>
+            <w:u w:val="single"/>
+            <w:sz w:val="17"/>
+            <w:szCs w:val="17"/>
+          </w:rPr>
+          <w:t>https://doi.org/10.1007/s42484-025-00247-7</w:t>
+        </w:r>
+      </w:hyperlink>
+    </w:p>
+    <w:p>
+      <w:pPr>
+        <w:widowControl/>
+        <w:spacing w:line="240" w:lineRule="auto" w:before="0" w:after="0"/>
+        <w:ind w:left="259" w:hanging="259"/>
+        <w:jc w:val="both"/>
+      </w:pPr>
       <w:r>
         <w:rPr>
           <w:rFonts w:ascii="Times New Roman" w:hAnsi="Times New Roman"/>
           <w:sz w:val="17"/>
         </w:rPr>
-        <w:t>Yang J et al (2023) MedMNIST v2: A large-scale lightweight benchmark for 2D and 3D biomedical image classification. Scientific Data 10:41. https://doi.org/10.1038/s41597-022-01721-8</w:t>
+        <w:t xml:space="preserve">Yang J et al (2023) MedMNIST v2: A large-scale lightweight benchmark for 2D and 3D biomedical image classification. Sci Data 10:41. </w:t>
       </w:r>
+      <w:hyperlink r:id="rId43">
+        <w:r>
+          <w:rPr>
+            <w:color w:val="0563C1"/>
+            <w:u w:val="single"/>
+            <w:sz w:val="17"/>
+            <w:szCs w:val="17"/>
+          </w:rPr>
+          <w:t>https://doi.org/10.1038/s41597-022-01721-8</w:t>
+        </w:r>
+      </w:hyperlink>
       <w:r>
         <w:fldChar w:fldCharType="end"/>
       </w:r>

</xml_diff>